<commit_message>
Align manuscript documents with the final supplementary figures
- Captions follow the style of the final supplementary (figure title in
  bold, then panels a-c without panel titles); Figure 6 uses the same
  style.
- Supplementary now has Figures S3-S6; the S7 example was dropped, and
  the main-text Results cite Figure S6 only.
- Corrected the S4 caption (standard model, 4 processes) and the time
  basis for stopped runs (simulated time); American spelling throughout.

Co-Authored-By: Claude Opus 5.5 <noreply@anthropic.com>
Claude-Session: https://claude.ai/code/session_011LpDcxqdY9rkLpBpkTdG8k
</commit_message>
<xml_diff>
--- a/results/alpha-robustness-v2/manuscript/robust_analysis_main_text.docx
+++ b/results/alpha-robustness-v2/manuscript/robust_analysis_main_text.docx
@@ -42,7 +42,7 @@
         <w:t xml:space="preserve">−5</w:t>
       </w:r>
       <w:r>
-        <w:t xml:space="preserve">) to 0.09 (α = 1), and the share of the sampled space requiring all processes for the whole window decreased from 9.0% to 0.4%. The model with carrying capacity and the simulations that had to be stopped because a population left the physical bounds led to similar or better results (carrying capacity: median error 0.77%, 988 of 999 simulations within 10%; stopped simulations: median error 0.0035% without and 0.0065% with carrying capacity, more than 99.9% of simulations within 10%; Supplementary Figures S3, S4 and S5). For α = 0.1, the carrying-capacity case showed 12 of 1,000 simulations above the tolerance (one of them an extreme outlier). These corresponded to long oscillatory trajectories in which the Boolean model accumulated a persistent delay with respect to the full model; the Boolean trajectories, relevant processes and process weights remained qualitatively in good agreement with the full model (Supplementary Figures S6 and S7).</w:t>
+        <w:t xml:space="preserve">) to 0.09 (α = 1), and the share of the sampled space requiring all processes for the whole window decreased from 9.0% to 0.4%. The model with carrying capacity and the simulations that had to be stopped because a population left the physical bounds led to similar or better results (carrying capacity: median error 0.77%, 988 of 999 simulations within 10%; stopped simulations: median error 0.0035% without and 0.0065% with carrying capacity, more than 99.9% of simulations within 10%; Supplementary Figures S3, S4 and S5). For α = 0.1, the carrying-capacity case showed 12 of 1,000 simulations above the tolerance (one of them an extreme outlier). These corresponded to long oscillatory trajectories in which the Boolean model accumulated a persistent delay with respect to the full model; the Boolean trajectories, relevant processes and process weights remained qualitatively in good agreement with the full model (Supplementary Figure S6).</w:t>
       </w:r>
     </w:p>
     <w:p>
@@ -293,7 +293,7 @@
         <w:t xml:space="preserve">3</w:t>
       </w:r>
       <w:r>
-        <w:t xml:space="preserve">, packed into 1 ml); both models were then compared up to the earliest stop time. The sample size was doubled (2,000, 4,000, …) until every α had at least 1,000 simulations covering the full observational window (16,000 samples without and 8,000 with carrying capacity), and 1,000 of these were selected at random for each α; stopped simulations with at least two compared time points were analysed separately. The accuracy of the Boolean model was measured as the mean combined relative error, the time average of ½(|B</w:t>
+        <w:t xml:space="preserve">, packed into 1 ml); both models were then compared up to the earliest stop time. The sample size was doubled (2,000, 4,000, …) until every α had at least 1,000 simulations covering the full observational window (16,000 samples without and 8,000 with carrying capacity), and 1,000 of these were selected at random for each α; stopped simulations with at least two compared time points were analyzed separately. The accuracy of the Boolean model was measured as the mean combined relative error, the time average of ½(|B</w:t>
       </w:r>
       <w:r>
         <w:rPr>
@@ -428,37 +428,37 @@
         <w:t xml:space="preserve">Figure 6. Robust analysis of the Boolean model.</w:t>
       </w:r>
       <w:r>
-        <w:t xml:space="preserve"> Latin hypercube sampling (log-uniform) of the parameters, initial concentrations and observational time of the phage–bacteria (Lotka–Volterra) model; only simulations that remained within the physical bounds for the full observational window are shown (n = 1,000 for α = 0.1). </w:t>
+        <w:t xml:space="preserve"> Latin hypercube sampling (log-uniform) of the parameters, initial concentrations, and observational time of the phage–bacteria (Lotka–Volterra) model; only simulations that remained within the physical bounds for the full observational window are shown (n = 1,000 for α = 0.1). </w:t>
       </w:r>
       <w:r>
         <w:rPr>
           <w:b/>
           <w:bCs/>
         </w:rPr>
-        <w:t xml:space="preserve">a) Robustness of transient model (α = 0.1):</w:t>
-      </w:r>
-      <w:r>
-        <w:t xml:space="preserve"> histogram of the mean combined relative error (%) between the transient (Boolean) and full models; the bar labelled 0 counts runs with zero error (all processes relevant throughout), the dashed line marks the median, and the solid black line marks the observer tolerance (10%). </w:t>
+        <w:t xml:space="preserve">a)</w:t>
+      </w:r>
+      <w:r>
+        <w:t xml:space="preserve"> Histogram of the mean combined relative error (%) between the transient (Boolean) and full models at α = 0.1; the bar labeled 0 counts runs with zero error (all processes relevant throughout), the dashed line marks the median, and the solid black line marks the observer tolerance (10%, corresponding to α = 0.1). </w:t>
       </w:r>
       <w:r>
         <w:rPr>
           <w:b/>
           <w:bCs/>
         </w:rPr>
-        <w:t xml:space="preserve">b) Variability of relevant processes (α = 0.1):</w:t>
-      </w:r>
-      <w:r>
-        <w:t xml:space="preserve"> fraction of the observational time that each run spent with 0 to 4 relevant processes (weight w ≥ 1); violins show the distribution across runs, grey points a random sample of 200 runs, and the numbers on top (n) the runs that spent any time with that number of relevant processes. </w:t>
+        <w:t xml:space="preserve">b)</w:t>
+      </w:r>
+      <w:r>
+        <w:t xml:space="preserve"> Fraction of the observational time that each run spent with 0 to 4 relevant processes (weight w ≥ 1) at α = 0.1; violins show the distribution across runs, gray points are a random sample of 200 runs, and the numbers on top (n) are the runs that spent any time with that number of relevant processes. </w:t>
       </w:r>
       <w:r>
         <w:rPr>
           <w:b/>
           <w:bCs/>
         </w:rPr>
-        <w:t xml:space="preserve">c) Robustness across tolerances (α):</w:t>
-      </w:r>
-      <w:r>
-        <w:t xml:space="preserve"> top, box plots of the mean combined relative error for α = 10</w:t>
+        <w:t xml:space="preserve">c)</w:t>
+      </w:r>
+      <w:r>
+        <w:t xml:space="preserve"> Top, box plots of the mean combined relative error for α = 10</w:t>
       </w:r>
       <w:r>
         <w:rPr>
@@ -467,7 +467,7 @@
         <w:t xml:space="preserve">−5</w:t>
       </w:r>
       <w:r>
-        <w:t xml:space="preserve"> to 1 (box, interquartile range, IQR; line, median; whiskers, 1.5 × IQR; points, values beyond the whiskers), with the mean (◆) and the observer tolerance, 100·α % (dashed line); zero errors are drawn at the bottom of the axis, labelled 0. Bottom, mean ± standard deviation of the fraction of time with all 4 processes relevant. Extreme outliers (Tukey's far-out test, above Q3 + 3 × IQR of log</w:t>
+        <w:t xml:space="preserve"> to 1 (box, interquartile range, IQR; line, median; whiskers, 1.5 × IQR; points, values beyond the whiskers), with the mean (◆) and the observer tolerance, 100·α % (dashed line); zero errors are drawn at the bottom of the axis, labeled 0. Bottom, mean ± standard deviation of the fraction of observational time with all 4 processes relevant. Extreme outliers (Tukey's far-out test, above Q3 + 3 × IQR of log</w:t>
       </w:r>
       <w:r>
         <w:rPr>

</xml_diff>